<commit_message>
Updated CSS, HTML, JS files and user manual for project
</commit_message>
<xml_diff>
--- a/UserManual v1Section3.docx
+++ b/UserManual v1Section3.docx
@@ -369,21 +369,12 @@
                     <w:lang w:val="en-CA"/>
                   </w:rPr>
                 </w:pPr>
-                <w:proofErr w:type="gramStart"/>
                 <w:r>
                   <w:rPr>
                     <w:color w:val="4F81BD" w:themeColor="accent1"/>
                     <w:lang w:val="en-CA"/>
                   </w:rPr>
-                  <w:t>Version :</w:t>
-                </w:r>
-                <w:proofErr w:type="gramEnd"/>
-                <w:r>
-                  <w:rPr>
-                    <w:color w:val="4F81BD" w:themeColor="accent1"/>
-                    <w:lang w:val="en-CA"/>
-                  </w:rPr>
-                  <w:t xml:space="preserve"> </w:t>
+                  <w:t xml:space="preserve">Version : </w:t>
                 </w:r>
                 <w:r>
                   <w:rPr>
@@ -556,9 +547,30 @@
       <w:pPr>
         <w:spacing w:after="0" w:line="240" w:lineRule="auto"/>
         <w:rPr>
+          <w:color w:val="000000" w:themeColor="text1"/>
+          <w:sz w:val="28"/>
+          <w:szCs w:val="28"/>
+          <w:lang w:val="en-CA"/>
+        </w:rPr>
+      </w:pPr>
+      <w:r>
+        <w:rPr>
+          <w:color w:val="000000" w:themeColor="text1"/>
+          <w:sz w:val="28"/>
+          <w:szCs w:val="28"/>
+          <w:lang w:val="en-CA"/>
+        </w:rPr>
+        <w:t>Enter personal user name and password to login.</w:t>
+      </w:r>
+    </w:p>
+    <w:p>
+      <w:pPr>
+        <w:spacing w:after="0" w:line="240" w:lineRule="auto"/>
+        <w:rPr>
           <w:color w:val="4F81BD" w:themeColor="accent1"/>
           <w:sz w:val="40"/>
           <w:szCs w:val="40"/>
+          <w:lang w:val="en-CA"/>
         </w:rPr>
       </w:pPr>
     </w:p>
@@ -567,10 +579,13 @@
         <w:spacing w:after="0"/>
       </w:pPr>
       <w:r>
+        <w:rPr>
+          <w:noProof/>
+        </w:rPr>
         <w:drawing>
-          <wp:inline distT="0" distB="0" distL="0" distR="0" wp14:anchorId="3258A8AD" wp14:editId="0090E85B">
-            <wp:extent cx="5943600" cy="2921635"/>
-            <wp:effectExtent l="0" t="0" r="0" b="0"/>
+          <wp:inline distT="0" distB="0" distL="0" distR="0" wp14:anchorId="3258A8AD" wp14:editId="12E2CBF3">
+            <wp:extent cx="4300423" cy="2113915"/>
+            <wp:effectExtent l="0" t="0" r="5080" b="635"/>
             <wp:docPr id="2144201120" name="Picture 1"/>
             <wp:cNvGraphicFramePr>
               <a:graphicFrameLocks xmlns:a="http://schemas.openxmlformats.org/drawingml/2006/main" noChangeAspect="1"/>
@@ -591,7 +606,7 @@
                   <pic:spPr>
                     <a:xfrm>
                       <a:off x="0" y="0"/>
-                      <a:ext cx="5943600" cy="2921635"/>
+                      <a:ext cx="4329079" cy="2128001"/>
                     </a:xfrm>
                     <a:prstGeom prst="rect">
                       <a:avLst/>
@@ -756,56 +771,8 @@
         <w:rPr>
           <w:lang w:val="fr-CA"/>
         </w:rPr>
-        <w:t xml:space="preserve">Logon Page           </w:t>
-      </w:r>
-      <w:proofErr w:type="spellStart"/>
-      <w:r>
-        <w:rPr>
-          <w:lang w:val="fr-CA"/>
-        </w:rPr>
-        <w:t>Afterlogin</w:t>
-      </w:r>
-      <w:proofErr w:type="spellEnd"/>
-    </w:p>
-    <w:p>
-      <w:pPr>
-        <w:spacing w:after="0"/>
-        <w:rPr>
-          <w:lang w:val="fr-CA"/>
-        </w:rPr>
-      </w:pPr>
-    </w:p>
-    <w:p>
-      <w:pPr>
-        <w:spacing w:after="0"/>
-        <w:rPr>
-          <w:lang w:val="fr-CA"/>
-        </w:rPr>
-      </w:pPr>
-    </w:p>
-    <w:p>
-      <w:pPr>
-        <w:spacing w:after="0"/>
-        <w:rPr>
-          <w:lang w:val="fr-CA"/>
-        </w:rPr>
-      </w:pPr>
-    </w:p>
-    <w:p>
-      <w:pPr>
-        <w:spacing w:after="0"/>
-        <w:rPr>
-          <w:lang w:val="fr-CA"/>
-        </w:rPr>
-      </w:pPr>
-    </w:p>
-    <w:p>
-      <w:pPr>
-        <w:spacing w:after="0"/>
-        <w:rPr>
-          <w:lang w:val="fr-CA"/>
-        </w:rPr>
-      </w:pPr>
+        <w:t>Logon Page           Afterlogin</w:t>
+      </w:r>
     </w:p>
     <w:p>
       <w:pPr>
@@ -815,8 +782,6 @@
           <w:lang w:val="fr-CA"/>
         </w:rPr>
       </w:pPr>
-      <w:proofErr w:type="spellStart"/>
-      <w:proofErr w:type="gramStart"/>
       <w:r>
         <w:rPr>
           <w:color w:val="4F81BD" w:themeColor="accent1"/>
@@ -824,19 +789,8 @@
           <w:szCs w:val="32"/>
           <w:lang w:val="fr-CA"/>
         </w:rPr>
-        <w:t>Welcome</w:t>
-      </w:r>
-      <w:proofErr w:type="spellEnd"/>
-      <w:r>
-        <w:rPr>
-          <w:color w:val="4F81BD" w:themeColor="accent1"/>
-          <w:sz w:val="32"/>
-          <w:szCs w:val="32"/>
-          <w:lang w:val="fr-CA"/>
-        </w:rPr>
-        <w:t xml:space="preserve">  Page</w:t>
-      </w:r>
-      <w:proofErr w:type="gramEnd"/>
+        <w:t>Welcome  Page</w:t>
+      </w:r>
     </w:p>
     <w:p>
       <w:pPr>
@@ -851,7 +805,10 @@
         <w:pStyle w:val="ListParagraph"/>
         <w:spacing w:after="0"/>
         <w:rPr>
-          <w:lang w:val="fr-CA"/>
+          <w:color w:val="4F81BD" w:themeColor="accent1"/>
+          <w:sz w:val="28"/>
+          <w:szCs w:val="28"/>
+          <w:lang w:val="en-CA"/>
         </w:rPr>
       </w:pPr>
       <w:r>
@@ -859,11 +816,10 @@
           <w:noProof/>
           <w:lang w:val="fr-CA"/>
         </w:rPr>
-        <w:lastRenderedPageBreak/>
         <w:drawing>
-          <wp:inline distT="0" distB="0" distL="0" distR="0" wp14:anchorId="61133C21" wp14:editId="733E2DB4">
-            <wp:extent cx="5943600" cy="2742565"/>
-            <wp:effectExtent l="0" t="0" r="0" b="635"/>
+          <wp:inline distT="0" distB="0" distL="0" distR="0" wp14:anchorId="3FDD86C8" wp14:editId="30888DFC">
+            <wp:extent cx="3631665" cy="1675765"/>
+            <wp:effectExtent l="0" t="0" r="6985" b="635"/>
             <wp:docPr id="1274542617" name="Picture 1" descr="A screenshot of a computer&#10;&#10;AI-generated content may be incorrect."/>
             <wp:cNvGraphicFramePr>
               <a:graphicFrameLocks xmlns:a="http://schemas.openxmlformats.org/drawingml/2006/main" noChangeAspect="1"/>
@@ -884,7 +840,7 @@
                   <pic:spPr>
                     <a:xfrm>
                       <a:off x="0" y="0"/>
-                      <a:ext cx="5943600" cy="2742565"/>
+                      <a:ext cx="3650258" cy="1684344"/>
                     </a:xfrm>
                     <a:prstGeom prst="rect">
                       <a:avLst/>
@@ -899,81 +855,65 @@
     </w:p>
     <w:p>
       <w:pPr>
-        <w:spacing w:after="0" w:line="240" w:lineRule="auto"/>
+        <w:spacing w:after="0"/>
+        <w:rPr>
+          <w:color w:val="4F81BD" w:themeColor="accent1"/>
+          <w:sz w:val="36"/>
+          <w:szCs w:val="36"/>
+          <w:lang w:val="en-CA"/>
+        </w:rPr>
+      </w:pPr>
+      <w:r>
+        <w:rPr>
+          <w:color w:val="4F81BD" w:themeColor="accent1"/>
+          <w:sz w:val="28"/>
+          <w:szCs w:val="28"/>
+          <w:lang w:val="en-CA"/>
+        </w:rPr>
+        <w:t>Description Page</w:t>
+      </w:r>
+    </w:p>
+    <w:p>
+      <w:pPr>
+        <w:rPr>
+          <w:lang w:val="en-CA"/>
+        </w:rPr>
+      </w:pPr>
+      <w:r>
+        <w:rPr>
+          <w:lang w:val="en-CA"/>
+        </w:rPr>
+        <w:t>Description</w:t>
+      </w:r>
+      <w:r>
+        <w:rPr>
+          <w:lang w:val="en-CA"/>
+        </w:rPr>
+        <w:t xml:space="preserve"> page about the</w:t>
+      </w:r>
+      <w:r>
+        <w:rPr>
+          <w:lang w:val="en-CA"/>
+        </w:rPr>
+        <w:t xml:space="preserve"> Cosmetic Product</w:t>
+      </w:r>
+    </w:p>
+    <w:p>
+      <w:pPr>
         <w:rPr>
           <w:noProof/>
           <w:lang w:val="fr-CA"/>
         </w:rPr>
       </w:pPr>
-    </w:p>
-    <w:p>
-      <w:pPr>
-        <w:rPr>
-          <w:lang w:val="fr-CA"/>
-        </w:rPr>
-      </w:pPr>
-    </w:p>
-    <w:p>
-      <w:pPr>
-        <w:rPr>
-          <w:lang w:val="fr-CA"/>
-        </w:rPr>
-      </w:pPr>
-    </w:p>
-    <w:p>
-      <w:pPr>
-        <w:rPr>
-          <w:color w:val="4F81BD" w:themeColor="accent1"/>
-          <w:sz w:val="40"/>
-          <w:szCs w:val="40"/>
-          <w:lang w:val="fr-CA"/>
-        </w:rPr>
-      </w:pPr>
-      <w:r>
-        <w:rPr>
-          <w:color w:val="4F81BD" w:themeColor="accent1"/>
-          <w:sz w:val="40"/>
-          <w:szCs w:val="40"/>
-          <w:lang w:val="fr-CA"/>
-        </w:rPr>
-        <w:t>Description Page</w:t>
-      </w:r>
-    </w:p>
-    <w:p>
-      <w:pPr>
-        <w:rPr>
-          <w:lang w:val="fr-CA"/>
-        </w:rPr>
-      </w:pPr>
-    </w:p>
-    <w:p>
-      <w:pPr>
-        <w:rPr>
-          <w:lang w:val="fr-CA"/>
-        </w:rPr>
-      </w:pPr>
-    </w:p>
-    <w:p>
-      <w:pPr>
-        <w:rPr>
-          <w:lang w:val="fr-CA"/>
-        </w:rPr>
-      </w:pPr>
-    </w:p>
-    <w:p>
-      <w:pPr>
-        <w:rPr>
-          <w:lang w:val="fr-CA"/>
-        </w:rPr>
-      </w:pPr>
       <w:r>
         <w:rPr>
           <w:noProof/>
           <w:lang w:val="fr-CA"/>
         </w:rPr>
+        <w:lastRenderedPageBreak/>
         <w:drawing>
-          <wp:inline distT="0" distB="0" distL="0" distR="0" wp14:anchorId="3FE65ADA" wp14:editId="748B4026">
-            <wp:extent cx="5943600" cy="2874010"/>
+          <wp:inline distT="0" distB="0" distL="0" distR="0" wp14:anchorId="3FE65ADA" wp14:editId="24252D17">
+            <wp:extent cx="4840501" cy="2340610"/>
             <wp:effectExtent l="0" t="0" r="0" b="2540"/>
             <wp:docPr id="1131727857" name="Picture 1" descr="A screenshot of a website&#10;&#10;AI-generated content may be incorrect."/>
             <wp:cNvGraphicFramePr>
@@ -995,7 +935,7 @@
                   <pic:spPr>
                     <a:xfrm>
                       <a:off x="0" y="0"/>
-                      <a:ext cx="5943600" cy="2874010"/>
+                      <a:ext cx="4854481" cy="2347370"/>
                     </a:xfrm>
                     <a:prstGeom prst="rect">
                       <a:avLst/>
@@ -1011,22 +951,104 @@
     <w:p>
       <w:pPr>
         <w:tabs>
-          <w:tab w:val="left" w:pos="1728"/>
+          <w:tab w:val="left" w:pos="3336"/>
         </w:tabs>
-        <w:rPr>
-          <w:lang w:val="fr-CA"/>
-        </w:rPr>
-      </w:pPr>
-      <w:r>
         <w:rPr>
           <w:noProof/>
           <w:lang w:val="fr-CA"/>
         </w:rPr>
-        <w:lastRenderedPageBreak/>
+      </w:pPr>
+      <w:r>
+        <w:rPr>
+          <w:color w:val="4F81BD" w:themeColor="accent1"/>
+          <w:sz w:val="40"/>
+          <w:szCs w:val="40"/>
+          <w:lang w:val="fr-CA"/>
+        </w:rPr>
+        <w:t>ImagePage</w:t>
+      </w:r>
+    </w:p>
+    <w:p>
+      <w:pPr>
+        <w:tabs>
+          <w:tab w:val="left" w:pos="3336"/>
+        </w:tabs>
+        <w:rPr>
+          <w:sz w:val="40"/>
+          <w:szCs w:val="40"/>
+          <w:lang w:val="fr-CA"/>
+        </w:rPr>
+      </w:pPr>
+      <w:r>
+        <w:rPr>
+          <w:noProof/>
+          <w:lang w:val="fr-CA"/>
+        </w:rPr>
         <w:drawing>
-          <wp:inline distT="0" distB="0" distL="0" distR="0" wp14:anchorId="6ABE1B8A" wp14:editId="28EDAE5D">
-            <wp:extent cx="5943600" cy="2898140"/>
-            <wp:effectExtent l="0" t="0" r="0" b="0"/>
+          <wp:inline distT="0" distB="0" distL="0" distR="0" wp14:anchorId="4409D919" wp14:editId="48DA7A95">
+            <wp:extent cx="4591650" cy="2225675"/>
+            <wp:effectExtent l="0" t="0" r="0" b="3175"/>
+            <wp:docPr id="207804909" name="Picture 1" descr="A screenshot of a web page&#10;&#10;AI-generated content may be incorrect."/>
+            <wp:cNvGraphicFramePr>
+              <a:graphicFrameLocks xmlns:a="http://schemas.openxmlformats.org/drawingml/2006/main" noChangeAspect="1"/>
+            </wp:cNvGraphicFramePr>
+            <a:graphic xmlns:a="http://schemas.openxmlformats.org/drawingml/2006/main">
+              <a:graphicData uri="http://schemas.openxmlformats.org/drawingml/2006/picture">
+                <pic:pic xmlns:pic="http://schemas.openxmlformats.org/drawingml/2006/picture">
+                  <pic:nvPicPr>
+                    <pic:cNvPr id="207804909" name="Picture 1" descr="A screenshot of a web page&#10;&#10;AI-generated content may be incorrect."/>
+                    <pic:cNvPicPr/>
+                  </pic:nvPicPr>
+                  <pic:blipFill>
+                    <a:blip r:embed="rId11"/>
+                    <a:stretch>
+                      <a:fillRect/>
+                    </a:stretch>
+                  </pic:blipFill>
+                  <pic:spPr>
+                    <a:xfrm>
+                      <a:off x="0" y="0"/>
+                      <a:ext cx="4607545" cy="2233380"/>
+                    </a:xfrm>
+                    <a:prstGeom prst="rect">
+                      <a:avLst/>
+                    </a:prstGeom>
+                  </pic:spPr>
+                </pic:pic>
+              </a:graphicData>
+            </a:graphic>
+          </wp:inline>
+        </w:drawing>
+      </w:r>
+    </w:p>
+    <w:p>
+      <w:pPr>
+        <w:tabs>
+          <w:tab w:val="left" w:pos="3336"/>
+        </w:tabs>
+        <w:rPr>
+          <w:sz w:val="28"/>
+          <w:szCs w:val="28"/>
+          <w:lang w:val="fr-CA"/>
+        </w:rPr>
+      </w:pPr>
+      <w:r>
+        <w:rPr>
+          <w:sz w:val="28"/>
+          <w:szCs w:val="28"/>
+          <w:lang w:val="fr-CA"/>
+        </w:rPr>
+        <w:t>History of Cosmetic Products</w:t>
+      </w:r>
+      <w:r>
+        <w:rPr>
+          <w:noProof/>
+          <w:lang w:val="fr-CA"/>
+        </w:rPr>
+        <w:drawing>
+          <wp:inline distT="0" distB="0" distL="0" distR="0" wp14:anchorId="75D4B6A4" wp14:editId="7C6FA138">
+            <wp:extent cx="4648200" cy="2266495"/>
+            <wp:effectExtent l="0" t="0" r="0" b="635"/>
             <wp:docPr id="355338264" name="Picture 1" descr="A screenshot of a web page&#10;&#10;AI-generated content may be incorrect."/>
             <wp:cNvGraphicFramePr>
               <a:graphicFrameLocks xmlns:a="http://schemas.openxmlformats.org/drawingml/2006/main" noChangeAspect="1"/>
@@ -1039,7 +1061,7 @@
                     <pic:cNvPicPr/>
                   </pic:nvPicPr>
                   <pic:blipFill>
-                    <a:blip r:embed="rId11"/>
+                    <a:blip r:embed="rId12"/>
                     <a:stretch>
                       <a:fillRect/>
                     </a:stretch>
@@ -1047,7 +1069,7 @@
                   <pic:spPr>
                     <a:xfrm>
                       <a:off x="0" y="0"/>
-                      <a:ext cx="5943600" cy="2898140"/>
+                      <a:ext cx="4663392" cy="2273903"/>
                     </a:xfrm>
                     <a:prstGeom prst="rect">
                       <a:avLst/>
@@ -1059,57 +1081,48 @@
           </wp:inline>
         </w:drawing>
       </w:r>
+    </w:p>
+    <w:p>
+      <w:pPr>
+        <w:tabs>
+          <w:tab w:val="left" w:pos="1728"/>
+        </w:tabs>
+        <w:rPr>
+          <w:noProof/>
+          <w:sz w:val="28"/>
+          <w:szCs w:val="28"/>
+          <w:lang w:val="en-CA"/>
+        </w:rPr>
+      </w:pPr>
+      <w:r>
+        <w:rPr>
+          <w:noProof/>
+          <w:sz w:val="28"/>
+          <w:szCs w:val="28"/>
+          <w:lang w:val="en-CA"/>
+        </w:rPr>
+        <w:lastRenderedPageBreak/>
+        <w:t>Ingredients of Cosmetic Products</w:t>
+      </w:r>
+    </w:p>
+    <w:p>
+      <w:pPr>
+        <w:tabs>
+          <w:tab w:val="left" w:pos="1728"/>
+        </w:tabs>
+        <w:rPr>
+          <w:lang w:val="en-CA"/>
+        </w:rPr>
+      </w:pPr>
       <w:r>
         <w:rPr>
           <w:noProof/>
           <w:lang w:val="fr-CA"/>
         </w:rPr>
         <w:drawing>
-          <wp:inline distT="0" distB="0" distL="0" distR="0" wp14:anchorId="4B614D39" wp14:editId="25748150">
-            <wp:extent cx="5943600" cy="2880995"/>
+          <wp:inline distT="0" distB="0" distL="0" distR="0" wp14:anchorId="046AA539" wp14:editId="47C844D8">
+            <wp:extent cx="4865663" cy="2305472"/>
             <wp:effectExtent l="0" t="0" r="0" b="0"/>
-            <wp:docPr id="207804909" name="Picture 1" descr="A screenshot of a web page&#10;&#10;AI-generated content may be incorrect."/>
-            <wp:cNvGraphicFramePr>
-              <a:graphicFrameLocks xmlns:a="http://schemas.openxmlformats.org/drawingml/2006/main" noChangeAspect="1"/>
-            </wp:cNvGraphicFramePr>
-            <a:graphic xmlns:a="http://schemas.openxmlformats.org/drawingml/2006/main">
-              <a:graphicData uri="http://schemas.openxmlformats.org/drawingml/2006/picture">
-                <pic:pic xmlns:pic="http://schemas.openxmlformats.org/drawingml/2006/picture">
-                  <pic:nvPicPr>
-                    <pic:cNvPr id="207804909" name="Picture 1" descr="A screenshot of a web page&#10;&#10;AI-generated content may be incorrect."/>
-                    <pic:cNvPicPr/>
-                  </pic:nvPicPr>
-                  <pic:blipFill>
-                    <a:blip r:embed="rId12"/>
-                    <a:stretch>
-                      <a:fillRect/>
-                    </a:stretch>
-                  </pic:blipFill>
-                  <pic:spPr>
-                    <a:xfrm>
-                      <a:off x="0" y="0"/>
-                      <a:ext cx="5943600" cy="2880995"/>
-                    </a:xfrm>
-                    <a:prstGeom prst="rect">
-                      <a:avLst/>
-                    </a:prstGeom>
-                  </pic:spPr>
-                </pic:pic>
-              </a:graphicData>
-            </a:graphic>
-          </wp:inline>
-        </w:drawing>
-      </w:r>
-      <w:r>
-        <w:rPr>
-          <w:noProof/>
-          <w:lang w:val="fr-CA"/>
-        </w:rPr>
-        <w:lastRenderedPageBreak/>
-        <w:drawing>
-          <wp:inline distT="0" distB="0" distL="0" distR="0" wp14:anchorId="6C1BF27A" wp14:editId="3E5A9DF1">
-            <wp:extent cx="5943600" cy="2816225"/>
-            <wp:effectExtent l="0" t="0" r="0" b="3175"/>
             <wp:docPr id="868778259" name="Picture 1" descr="A screenshot of a web development&#10;&#10;AI-generated content may be incorrect."/>
             <wp:cNvGraphicFramePr>
               <a:graphicFrameLocks xmlns:a="http://schemas.openxmlformats.org/drawingml/2006/main" noChangeAspect="1"/>
@@ -1130,7 +1143,7 @@
                   <pic:spPr>
                     <a:xfrm>
                       <a:off x="0" y="0"/>
-                      <a:ext cx="5943600" cy="2816225"/>
+                      <a:ext cx="4905029" cy="2324124"/>
                     </a:xfrm>
                     <a:prstGeom prst="rect">
                       <a:avLst/>
@@ -1142,135 +1155,15 @@
           </wp:inline>
         </w:drawing>
       </w:r>
-    </w:p>
-    <w:p>
-      <w:pPr>
-        <w:spacing w:after="0" w:line="240" w:lineRule="auto"/>
-        <w:rPr>
-          <w:noProof/>
-          <w:lang w:val="fr-CA"/>
-        </w:rPr>
-      </w:pPr>
-    </w:p>
-    <w:p>
-      <w:pPr>
-        <w:spacing w:after="0" w:line="240" w:lineRule="auto"/>
-        <w:rPr>
-          <w:noProof/>
-          <w:lang w:val="fr-CA"/>
-        </w:rPr>
-      </w:pPr>
-    </w:p>
-    <w:p>
-      <w:pPr>
-        <w:spacing w:after="0" w:line="240" w:lineRule="auto"/>
-        <w:rPr>
-          <w:noProof/>
-          <w:lang w:val="fr-CA"/>
-        </w:rPr>
-      </w:pPr>
-    </w:p>
-    <w:p>
-      <w:pPr>
-        <w:spacing w:after="0" w:line="240" w:lineRule="auto"/>
-        <w:rPr>
-          <w:noProof/>
-          <w:lang w:val="fr-CA"/>
-        </w:rPr>
-      </w:pPr>
-    </w:p>
-    <w:p>
-      <w:pPr>
-        <w:spacing w:after="0" w:line="240" w:lineRule="auto"/>
-        <w:rPr>
-          <w:noProof/>
-          <w:lang w:val="fr-CA"/>
-        </w:rPr>
-      </w:pPr>
-    </w:p>
-    <w:p>
-      <w:pPr>
-        <w:spacing w:after="0" w:line="240" w:lineRule="auto"/>
-        <w:rPr>
-          <w:noProof/>
-          <w:lang w:val="fr-CA"/>
-        </w:rPr>
-      </w:pPr>
-    </w:p>
-    <w:p>
-      <w:pPr>
-        <w:spacing w:after="0" w:line="240" w:lineRule="auto"/>
-        <w:rPr>
-          <w:noProof/>
-          <w:lang w:val="fr-CA"/>
-        </w:rPr>
-      </w:pPr>
-    </w:p>
-    <w:p>
-      <w:pPr>
-        <w:spacing w:after="0" w:line="240" w:lineRule="auto"/>
-        <w:rPr>
-          <w:noProof/>
-          <w:lang w:val="fr-CA"/>
-        </w:rPr>
-      </w:pPr>
-    </w:p>
-    <w:p>
-      <w:pPr>
-        <w:spacing w:after="0" w:line="240" w:lineRule="auto"/>
-        <w:rPr>
-          <w:noProof/>
-          <w:lang w:val="fr-CA"/>
-        </w:rPr>
-      </w:pPr>
-    </w:p>
-    <w:p>
-      <w:pPr>
-        <w:spacing w:after="0" w:line="240" w:lineRule="auto"/>
-        <w:rPr>
-          <w:noProof/>
-          <w:lang w:val="fr-CA"/>
-        </w:rPr>
-      </w:pPr>
-    </w:p>
-    <w:p>
-      <w:pPr>
-        <w:spacing w:after="0" w:line="240" w:lineRule="auto"/>
-        <w:rPr>
-          <w:noProof/>
-          <w:lang w:val="fr-CA"/>
-        </w:rPr>
-      </w:pPr>
-    </w:p>
-    <w:p>
-      <w:pPr>
-        <w:spacing w:after="0" w:line="240" w:lineRule="auto"/>
-        <w:rPr>
-          <w:noProof/>
-          <w:lang w:val="fr-CA"/>
-        </w:rPr>
-      </w:pPr>
-    </w:p>
-    <w:p>
-      <w:pPr>
-        <w:spacing w:after="0" w:line="240" w:lineRule="auto"/>
+      <w:r>
         <w:rPr>
           <w:noProof/>
           <w:color w:val="4F81BD" w:themeColor="accent1"/>
           <w:sz w:val="40"/>
           <w:szCs w:val="40"/>
-          <w:lang w:val="fr-CA"/>
-        </w:rPr>
-      </w:pPr>
-      <w:r>
-        <w:rPr>
-          <w:noProof/>
-          <w:color w:val="4F81BD" w:themeColor="accent1"/>
-          <w:sz w:val="40"/>
-          <w:szCs w:val="40"/>
-          <w:lang w:val="fr-CA"/>
-        </w:rPr>
-        <w:t>3rd Page Imagemap</w:t>
+          <w:lang w:val="en-CA"/>
+        </w:rPr>
+        <w:t>Imagemap</w:t>
       </w:r>
       <w:r>
         <w:rPr>
@@ -1278,8 +1171,8 @@
           <w:lang w:val="fr-CA"/>
         </w:rPr>
         <w:drawing>
-          <wp:inline distT="0" distB="0" distL="0" distR="0" wp14:anchorId="752E6C4F" wp14:editId="7628C4A2">
-            <wp:extent cx="5943600" cy="2828290"/>
+          <wp:inline distT="0" distB="0" distL="0" distR="0" wp14:anchorId="752E6C4F" wp14:editId="6C95F947">
+            <wp:extent cx="4934763" cy="2348230"/>
             <wp:effectExtent l="0" t="0" r="0" b="0"/>
             <wp:docPr id="993600162" name="Picture 1" descr="A close-up of a makeup bag&#10;&#10;AI-generated content may be incorrect."/>
             <wp:cNvGraphicFramePr>
@@ -1301,7 +1194,7 @@
                   <pic:spPr>
                     <a:xfrm>
                       <a:off x="0" y="0"/>
-                      <a:ext cx="5943600" cy="2828290"/>
+                      <a:ext cx="4937066" cy="2349326"/>
                     </a:xfrm>
                     <a:prstGeom prst="rect">
                       <a:avLst/>
@@ -1327,11 +1220,10 @@
           <w:noProof/>
           <w:lang w:val="fr-CA"/>
         </w:rPr>
-        <w:lastRenderedPageBreak/>
         <w:drawing>
-          <wp:inline distT="0" distB="0" distL="0" distR="0" wp14:anchorId="6E54C1B3" wp14:editId="1EC85318">
-            <wp:extent cx="5943600" cy="2851785"/>
-            <wp:effectExtent l="0" t="0" r="0" b="5715"/>
+          <wp:inline distT="0" distB="0" distL="0" distR="0" wp14:anchorId="6E54C1B3" wp14:editId="2FCFFCB0">
+            <wp:extent cx="5483040" cy="2630805"/>
+            <wp:effectExtent l="0" t="0" r="3810" b="0"/>
             <wp:docPr id="1621871827" name="Picture 1"/>
             <wp:cNvGraphicFramePr>
               <a:graphicFrameLocks xmlns:a="http://schemas.openxmlformats.org/drawingml/2006/main" noChangeAspect="1"/>
@@ -1352,7 +1244,7 @@
                   <pic:spPr>
                     <a:xfrm>
                       <a:off x="0" y="0"/>
-                      <a:ext cx="5943600" cy="2851785"/>
+                      <a:ext cx="5497811" cy="2637892"/>
                     </a:xfrm>
                     <a:prstGeom prst="rect">
                       <a:avLst/>
@@ -1373,136 +1265,7 @@
           <w:lang w:val="fr-CA"/>
         </w:rPr>
       </w:pPr>
-    </w:p>
-    <w:p>
-      <w:pPr>
-        <w:spacing w:after="0" w:line="240" w:lineRule="auto"/>
-        <w:rPr>
-          <w:noProof/>
-          <w:lang w:val="fr-CA"/>
-        </w:rPr>
-      </w:pPr>
-    </w:p>
-    <w:p>
-      <w:pPr>
-        <w:spacing w:after="0" w:line="240" w:lineRule="auto"/>
-        <w:rPr>
-          <w:noProof/>
-          <w:lang w:val="fr-CA"/>
-        </w:rPr>
-      </w:pPr>
-    </w:p>
-    <w:p>
-      <w:pPr>
-        <w:spacing w:after="0" w:line="240" w:lineRule="auto"/>
-        <w:rPr>
-          <w:noProof/>
-          <w:lang w:val="fr-CA"/>
-        </w:rPr>
-      </w:pPr>
-    </w:p>
-    <w:p>
-      <w:pPr>
-        <w:spacing w:after="0" w:line="240" w:lineRule="auto"/>
-        <w:rPr>
-          <w:noProof/>
-          <w:lang w:val="fr-CA"/>
-        </w:rPr>
-      </w:pPr>
-    </w:p>
-    <w:p>
-      <w:pPr>
-        <w:spacing w:after="0" w:line="240" w:lineRule="auto"/>
-        <w:rPr>
-          <w:noProof/>
-          <w:lang w:val="fr-CA"/>
-        </w:rPr>
-      </w:pPr>
-    </w:p>
-    <w:p>
-      <w:pPr>
-        <w:spacing w:after="0" w:line="240" w:lineRule="auto"/>
-        <w:rPr>
-          <w:noProof/>
-          <w:lang w:val="fr-CA"/>
-        </w:rPr>
-      </w:pPr>
-    </w:p>
-    <w:p>
-      <w:pPr>
-        <w:spacing w:after="0" w:line="240" w:lineRule="auto"/>
-        <w:rPr>
-          <w:noProof/>
-          <w:lang w:val="fr-CA"/>
-        </w:rPr>
-      </w:pPr>
-    </w:p>
-    <w:p>
-      <w:pPr>
-        <w:spacing w:after="0" w:line="240" w:lineRule="auto"/>
-        <w:rPr>
-          <w:noProof/>
-          <w:lang w:val="fr-CA"/>
-        </w:rPr>
-      </w:pPr>
-    </w:p>
-    <w:p>
-      <w:pPr>
-        <w:spacing w:after="0" w:line="240" w:lineRule="auto"/>
-        <w:rPr>
-          <w:noProof/>
-          <w:lang w:val="fr-CA"/>
-        </w:rPr>
-      </w:pPr>
-    </w:p>
-    <w:p>
-      <w:pPr>
-        <w:spacing w:after="0" w:line="240" w:lineRule="auto"/>
-        <w:rPr>
-          <w:noProof/>
-          <w:lang w:val="fr-CA"/>
-        </w:rPr>
-      </w:pPr>
-    </w:p>
-    <w:p>
-      <w:pPr>
-        <w:spacing w:after="0" w:line="240" w:lineRule="auto"/>
-        <w:rPr>
-          <w:noProof/>
-          <w:lang w:val="fr-CA"/>
-        </w:rPr>
-      </w:pPr>
-    </w:p>
-    <w:p>
-      <w:pPr>
-        <w:spacing w:after="0" w:line="240" w:lineRule="auto"/>
-        <w:rPr>
-          <w:noProof/>
-          <w:lang w:val="fr-CA"/>
-        </w:rPr>
-      </w:pPr>
-    </w:p>
-    <w:p>
-      <w:pPr>
-        <w:spacing w:after="0" w:line="240" w:lineRule="auto"/>
-        <w:rPr>
-          <w:noProof/>
-          <w:lang w:val="fr-CA"/>
-        </w:rPr>
-      </w:pPr>
-    </w:p>
-    <w:p>
-      <w:pPr>
-        <w:spacing w:after="0" w:line="240" w:lineRule="auto"/>
-        <w:rPr>
-          <w:noProof/>
-          <w:lang w:val="fr-CA"/>
-        </w:rPr>
-      </w:pPr>
-    </w:p>
-    <w:p>
-      <w:pPr>
-        <w:spacing w:after="0" w:line="240" w:lineRule="auto"/>
+      <w:r>
         <w:rPr>
           <w:noProof/>
           <w:color w:val="4F81BD" w:themeColor="accent1"/>
@@ -1510,64 +1273,34 @@
           <w:szCs w:val="36"/>
           <w:lang w:val="fr-CA"/>
         </w:rPr>
-      </w:pPr>
-      <w:r>
-        <w:rPr>
-          <w:noProof/>
-          <w:color w:val="4F81BD" w:themeColor="accent1"/>
-          <w:sz w:val="36"/>
-          <w:szCs w:val="36"/>
+        <w:lastRenderedPageBreak/>
+        <w:t xml:space="preserve"> Keyword Display</w:t>
+      </w:r>
+    </w:p>
+    <w:p>
+      <w:pPr>
+        <w:spacing w:after="0" w:line="240" w:lineRule="auto"/>
+        <w:rPr>
           <w:lang w:val="fr-CA"/>
         </w:rPr>
-        <w:t>4th Page Keyword Display</w:t>
-      </w:r>
-    </w:p>
-    <w:p>
-      <w:pPr>
-        <w:spacing w:after="0" w:line="240" w:lineRule="auto"/>
-        <w:rPr>
-          <w:noProof/>
-          <w:color w:val="4F81BD" w:themeColor="accent1"/>
-          <w:sz w:val="36"/>
-          <w:szCs w:val="36"/>
+      </w:pPr>
+    </w:p>
+    <w:p>
+      <w:pPr>
+        <w:spacing w:after="0" w:line="240" w:lineRule="auto"/>
+        <w:rPr>
           <w:lang w:val="fr-CA"/>
         </w:rPr>
       </w:pPr>
-    </w:p>
-    <w:p>
-      <w:pPr>
-        <w:spacing w:after="0" w:line="240" w:lineRule="auto"/>
+      <w:r>
         <w:rPr>
           <w:noProof/>
           <w:lang w:val="fr-CA"/>
         </w:rPr>
-      </w:pPr>
-    </w:p>
-    <w:p>
-      <w:pPr>
-        <w:spacing w:after="0" w:line="240" w:lineRule="auto"/>
-        <w:rPr>
-          <w:lang w:val="fr-CA"/>
-        </w:rPr>
-      </w:pPr>
-    </w:p>
-    <w:p>
-      <w:pPr>
-        <w:spacing w:after="0" w:line="240" w:lineRule="auto"/>
-        <w:rPr>
-          <w:lang w:val="fr-CA"/>
-        </w:rPr>
-      </w:pPr>
-      <w:r>
-        <w:rPr>
-          <w:noProof/>
-          <w:lang w:val="fr-CA"/>
-        </w:rPr>
-        <w:lastRenderedPageBreak/>
         <w:drawing>
-          <wp:inline distT="0" distB="0" distL="0" distR="0" wp14:anchorId="11CC9061" wp14:editId="29F40AA9">
-            <wp:extent cx="5943600" cy="2867660"/>
-            <wp:effectExtent l="0" t="0" r="0" b="8890"/>
+          <wp:inline distT="0" distB="0" distL="0" distR="0" wp14:anchorId="11CC9061" wp14:editId="6810D988">
+            <wp:extent cx="5390829" cy="2600960"/>
+            <wp:effectExtent l="0" t="0" r="635" b="8890"/>
             <wp:docPr id="50304083" name="Picture 1" descr="A screenshot of a web development&#10;&#10;AI-generated content may be incorrect."/>
             <wp:cNvGraphicFramePr>
               <a:graphicFrameLocks xmlns:a="http://schemas.openxmlformats.org/drawingml/2006/main" noChangeAspect="1"/>
@@ -1588,7 +1321,7 @@
                   <pic:spPr>
                     <a:xfrm>
                       <a:off x="0" y="0"/>
-                      <a:ext cx="5943600" cy="2867660"/>
+                      <a:ext cx="5396626" cy="2603757"/>
                     </a:xfrm>
                     <a:prstGeom prst="rect">
                       <a:avLst/>
@@ -1605,38 +1338,6 @@
       <w:pPr>
         <w:spacing w:after="0" w:line="240" w:lineRule="auto"/>
         <w:rPr>
-          <w:lang w:val="en-CA"/>
-        </w:rPr>
-      </w:pPr>
-    </w:p>
-    <w:p>
-      <w:pPr>
-        <w:spacing w:after="0" w:line="240" w:lineRule="auto"/>
-        <w:rPr>
-          <w:lang w:val="en-CA"/>
-        </w:rPr>
-      </w:pPr>
-    </w:p>
-    <w:p>
-      <w:pPr>
-        <w:spacing w:after="0" w:line="240" w:lineRule="auto"/>
-        <w:rPr>
-          <w:lang w:val="en-CA"/>
-        </w:rPr>
-      </w:pPr>
-    </w:p>
-    <w:p>
-      <w:pPr>
-        <w:spacing w:after="0" w:line="240" w:lineRule="auto"/>
-        <w:rPr>
-          <w:lang w:val="en-CA"/>
-        </w:rPr>
-      </w:pPr>
-    </w:p>
-    <w:p>
-      <w:pPr>
-        <w:spacing w:after="0" w:line="240" w:lineRule="auto"/>
-        <w:rPr>
           <w:color w:val="4F81BD" w:themeColor="accent1"/>
           <w:sz w:val="40"/>
           <w:szCs w:val="40"/>
@@ -1650,42 +1351,33 @@
           <w:szCs w:val="40"/>
           <w:lang w:val="en-CA"/>
         </w:rPr>
-        <w:t>5</w:t>
+        <w:t>Product shopping</w:t>
       </w:r>
       <w:r>
         <w:rPr>
           <w:color w:val="4F81BD" w:themeColor="accent1"/>
           <w:sz w:val="40"/>
           <w:szCs w:val="40"/>
-          <w:vertAlign w:val="superscript"/>
-          <w:lang w:val="en-CA"/>
-        </w:rPr>
-        <w:t>th</w:t>
-      </w:r>
-      <w:r>
-        <w:rPr>
-          <w:color w:val="4F81BD" w:themeColor="accent1"/>
-          <w:sz w:val="40"/>
-          <w:szCs w:val="40"/>
-          <w:lang w:val="en-CA"/>
-        </w:rPr>
-        <w:t xml:space="preserve"> Page </w:t>
-      </w:r>
-    </w:p>
-    <w:p>
-      <w:pPr>
-        <w:spacing w:after="0" w:line="240" w:lineRule="auto"/>
-        <w:rPr>
-          <w:lang w:val="en-CA"/>
-        </w:rPr>
-      </w:pPr>
-      <w:r>
-        <w:rPr>
+          <w:lang w:val="en-CA"/>
+        </w:rPr>
+        <w:t xml:space="preserve"> </w:t>
+      </w:r>
+    </w:p>
+    <w:p>
+      <w:pPr>
+        <w:spacing w:after="0" w:line="240" w:lineRule="auto"/>
+        <w:rPr>
+          <w:lang w:val="en-CA"/>
+        </w:rPr>
+      </w:pPr>
+      <w:r>
+        <w:rPr>
+          <w:noProof/>
           <w:lang w:val="en-CA"/>
         </w:rPr>
         <w:drawing>
-          <wp:inline distT="0" distB="0" distL="0" distR="0" wp14:anchorId="09F01B8E" wp14:editId="5A554BE6">
-            <wp:extent cx="5943600" cy="2917190"/>
+          <wp:inline distT="0" distB="0" distL="0" distR="0" wp14:anchorId="09F01B8E" wp14:editId="5548BD78">
+            <wp:extent cx="2806197" cy="1377315"/>
             <wp:effectExtent l="0" t="0" r="0" b="0"/>
             <wp:docPr id="1361313252" name="Picture 1"/>
             <wp:cNvGraphicFramePr>
@@ -1707,7 +1399,7 @@
                   <pic:spPr>
                     <a:xfrm>
                       <a:off x="0" y="0"/>
-                      <a:ext cx="5943600" cy="2917190"/>
+                      <a:ext cx="2836966" cy="1392417"/>
                     </a:xfrm>
                     <a:prstGeom prst="rect">
                       <a:avLst/>
@@ -1729,14 +1421,14 @@
       </w:pPr>
       <w:r>
         <w:rPr>
-          <w:lang w:val="en-CA"/>
-        </w:rPr>
-        <w:lastRenderedPageBreak/>
+          <w:noProof/>
+          <w:lang w:val="en-CA"/>
+        </w:rPr>
         <w:drawing>
-          <wp:inline distT="0" distB="0" distL="0" distR="0" wp14:anchorId="6F925A82" wp14:editId="1990080F">
-            <wp:extent cx="5943600" cy="2858770"/>
+          <wp:inline distT="0" distB="0" distL="0" distR="0" wp14:anchorId="0B9D7B4A" wp14:editId="5CB46D9A">
+            <wp:extent cx="3148708" cy="1514475"/>
             <wp:effectExtent l="0" t="0" r="0" b="0"/>
-            <wp:docPr id="1997091727" name="Picture 1"/>
+            <wp:docPr id="1997091727" name="Picture 1" descr="A screenshot of a computer&#10;&#10;AI-generated content may be incorrect."/>
             <wp:cNvGraphicFramePr>
               <a:graphicFrameLocks xmlns:a="http://schemas.openxmlformats.org/drawingml/2006/main" noChangeAspect="1"/>
             </wp:cNvGraphicFramePr>
@@ -1744,7 +1436,7 @@
               <a:graphicData uri="http://schemas.openxmlformats.org/drawingml/2006/picture">
                 <pic:pic xmlns:pic="http://schemas.openxmlformats.org/drawingml/2006/picture">
                   <pic:nvPicPr>
-                    <pic:cNvPr id="1997091727" name=""/>
+                    <pic:cNvPr id="1997091727" name="Picture 1" descr="A screenshot of a computer&#10;&#10;AI-generated content may be incorrect."/>
                     <pic:cNvPicPr/>
                   </pic:nvPicPr>
                   <pic:blipFill>
@@ -1756,7 +1448,7 @@
                   <pic:spPr>
                     <a:xfrm>
                       <a:off x="0" y="0"/>
-                      <a:ext cx="5943600" cy="2858770"/>
+                      <a:ext cx="3211841" cy="1544841"/>
                     </a:xfrm>
                     <a:prstGeom prst="rect">
                       <a:avLst/>
@@ -1768,23 +1460,16 @@
           </wp:inline>
         </w:drawing>
       </w:r>
-    </w:p>
-    <w:p>
-      <w:pPr>
-        <w:spacing w:after="0" w:line="240" w:lineRule="auto"/>
-        <w:rPr>
-          <w:lang w:val="en-CA"/>
-        </w:rPr>
-      </w:pPr>
-      <w:r>
-        <w:rPr>
+      <w:r>
+        <w:rPr>
+          <w:noProof/>
           <w:lang w:val="en-CA"/>
         </w:rPr>
         <w:drawing>
-          <wp:inline distT="0" distB="0" distL="0" distR="0" wp14:anchorId="78F700EA" wp14:editId="4F16BB3A">
-            <wp:extent cx="5943600" cy="2816225"/>
-            <wp:effectExtent l="0" t="0" r="0" b="3175"/>
-            <wp:docPr id="813888161" name="Picture 1"/>
+          <wp:inline distT="0" distB="0" distL="0" distR="0" wp14:anchorId="243982C4" wp14:editId="6196C504">
+            <wp:extent cx="3932991" cy="1863548"/>
+            <wp:effectExtent l="0" t="0" r="0" b="3810"/>
+            <wp:docPr id="813888161" name="Picture 1" descr="A screenshot of a web page&#10;&#10;AI-generated content may be incorrect."/>
             <wp:cNvGraphicFramePr>
               <a:graphicFrameLocks xmlns:a="http://schemas.openxmlformats.org/drawingml/2006/main" noChangeAspect="1"/>
             </wp:cNvGraphicFramePr>
@@ -1792,7 +1477,7 @@
               <a:graphicData uri="http://schemas.openxmlformats.org/drawingml/2006/picture">
                 <pic:pic xmlns:pic="http://schemas.openxmlformats.org/drawingml/2006/picture">
                   <pic:nvPicPr>
-                    <pic:cNvPr id="813888161" name=""/>
+                    <pic:cNvPr id="813888161" name="Picture 1" descr="A screenshot of a web page&#10;&#10;AI-generated content may be incorrect."/>
                     <pic:cNvPicPr/>
                   </pic:nvPicPr>
                   <pic:blipFill>
@@ -1804,7 +1489,7 @@
                   <pic:spPr>
                     <a:xfrm>
                       <a:off x="0" y="0"/>
-                      <a:ext cx="5943600" cy="2816225"/>
+                      <a:ext cx="3965566" cy="1878983"/>
                     </a:xfrm>
                     <a:prstGeom prst="rect">
                       <a:avLst/>
@@ -1824,24 +1509,14 @@
           <w:lang w:val="en-CA"/>
         </w:rPr>
       </w:pPr>
-    </w:p>
-    <w:p>
-      <w:pPr>
-        <w:spacing w:after="0" w:line="240" w:lineRule="auto"/>
+      <w:r>
         <w:rPr>
           <w:color w:val="4F81BD" w:themeColor="accent1"/>
           <w:sz w:val="40"/>
           <w:szCs w:val="40"/>
           <w:lang w:val="en-CA"/>
         </w:rPr>
-      </w:pPr>
-      <w:r>
-        <w:rPr>
-          <w:color w:val="4F81BD" w:themeColor="accent1"/>
-          <w:sz w:val="40"/>
-          <w:szCs w:val="40"/>
-          <w:lang w:val="en-CA"/>
-        </w:rPr>
+        <w:lastRenderedPageBreak/>
         <w:t>6</w:t>
       </w:r>
       <w:r>
@@ -1893,13 +1568,13 @@
       </w:pPr>
       <w:r>
         <w:rPr>
-          <w:lang w:val="en-CA"/>
-        </w:rPr>
-        <w:lastRenderedPageBreak/>
+          <w:noProof/>
+          <w:lang w:val="en-CA"/>
+        </w:rPr>
         <w:drawing>
-          <wp:inline distT="0" distB="0" distL="0" distR="0" wp14:anchorId="7F54F312" wp14:editId="7A2E5F39">
-            <wp:extent cx="5943600" cy="2898140"/>
-            <wp:effectExtent l="0" t="0" r="0" b="0"/>
+          <wp:inline distT="0" distB="0" distL="0" distR="0" wp14:anchorId="7F54F312" wp14:editId="33C379E9">
+            <wp:extent cx="4599096" cy="2242551"/>
+            <wp:effectExtent l="0" t="0" r="0" b="5715"/>
             <wp:docPr id="367872423" name="Picture 1"/>
             <wp:cNvGraphicFramePr>
               <a:graphicFrameLocks xmlns:a="http://schemas.openxmlformats.org/drawingml/2006/main" noChangeAspect="1"/>
@@ -1920,7 +1595,7 @@
                   <pic:spPr>
                     <a:xfrm>
                       <a:off x="0" y="0"/>
-                      <a:ext cx="5943600" cy="2898140"/>
+                      <a:ext cx="4615809" cy="2250700"/>
                     </a:xfrm>
                     <a:prstGeom prst="rect">
                       <a:avLst/>
@@ -1942,11 +1617,12 @@
       </w:pPr>
       <w:r>
         <w:rPr>
+          <w:noProof/>
           <w:lang w:val="en-CA"/>
         </w:rPr>
         <w:drawing>
-          <wp:inline distT="0" distB="0" distL="0" distR="0" wp14:anchorId="60BD39AC" wp14:editId="2B8D48C3">
-            <wp:extent cx="5943600" cy="2839720"/>
+          <wp:inline distT="0" distB="0" distL="0" distR="0" wp14:anchorId="60BD39AC" wp14:editId="0693ACA6">
+            <wp:extent cx="4634466" cy="2214245"/>
             <wp:effectExtent l="0" t="0" r="0" b="0"/>
             <wp:docPr id="581902634" name="Picture 1"/>
             <wp:cNvGraphicFramePr>
@@ -1968,7 +1644,7 @@
                   <pic:spPr>
                     <a:xfrm>
                       <a:off x="0" y="0"/>
-                      <a:ext cx="5943600" cy="2839720"/>
+                      <a:ext cx="4664382" cy="2228538"/>
                     </a:xfrm>
                     <a:prstGeom prst="rect">
                       <a:avLst/>
@@ -1990,13 +1666,13 @@
       </w:pPr>
       <w:r>
         <w:rPr>
-          <w:lang w:val="en-CA"/>
-        </w:rPr>
-        <w:lastRenderedPageBreak/>
+          <w:noProof/>
+          <w:lang w:val="en-CA"/>
+        </w:rPr>
         <w:drawing>
-          <wp:inline distT="0" distB="0" distL="0" distR="0" wp14:anchorId="5E42B53C" wp14:editId="5C7F2398">
-            <wp:extent cx="5943600" cy="2884170"/>
-            <wp:effectExtent l="0" t="0" r="0" b="0"/>
+          <wp:inline distT="0" distB="0" distL="0" distR="0" wp14:anchorId="5E42B53C" wp14:editId="4DBD655A">
+            <wp:extent cx="4623234" cy="2243455"/>
+            <wp:effectExtent l="0" t="0" r="6350" b="4445"/>
             <wp:docPr id="1539178873" name="Picture 1"/>
             <wp:cNvGraphicFramePr>
               <a:graphicFrameLocks xmlns:a="http://schemas.openxmlformats.org/drawingml/2006/main" noChangeAspect="1"/>
@@ -2017,7 +1693,7 @@
                   <pic:spPr>
                     <a:xfrm>
                       <a:off x="0" y="0"/>
-                      <a:ext cx="5943600" cy="2884170"/>
+                      <a:ext cx="4673010" cy="2267609"/>
                     </a:xfrm>
                     <a:prstGeom prst="rect">
                       <a:avLst/>
@@ -2042,6 +1718,30 @@
       <w:pPr>
         <w:spacing w:after="0" w:line="240" w:lineRule="auto"/>
         <w:rPr>
+          <w:lang w:val="en-CA"/>
+        </w:rPr>
+      </w:pPr>
+    </w:p>
+    <w:p>
+      <w:pPr>
+        <w:spacing w:after="0" w:line="240" w:lineRule="auto"/>
+        <w:rPr>
+          <w:lang w:val="en-CA"/>
+        </w:rPr>
+      </w:pPr>
+    </w:p>
+    <w:p>
+      <w:pPr>
+        <w:spacing w:after="0" w:line="240" w:lineRule="auto"/>
+        <w:rPr>
+          <w:lang w:val="en-CA"/>
+        </w:rPr>
+      </w:pPr>
+    </w:p>
+    <w:p>
+      <w:pPr>
+        <w:spacing w:after="0" w:line="240" w:lineRule="auto"/>
+        <w:rPr>
           <w:color w:val="4F81BD" w:themeColor="accent1"/>
           <w:sz w:val="36"/>
           <w:szCs w:val="36"/>
@@ -2055,27 +1755,29 @@
           <w:szCs w:val="36"/>
           <w:lang w:val="en-CA"/>
         </w:rPr>
-        <w:t>7</w:t>
+        <w:lastRenderedPageBreak/>
+        <w:t>Reference</w:t>
       </w:r>
       <w:r>
         <w:rPr>
           <w:color w:val="4F81BD" w:themeColor="accent1"/>
           <w:sz w:val="36"/>
           <w:szCs w:val="36"/>
-          <w:vertAlign w:val="superscript"/>
-          <w:lang w:val="en-CA"/>
-        </w:rPr>
-        <w:t>th</w:t>
-      </w:r>
-      <w:r>
+          <w:lang w:val="en-CA"/>
+        </w:rPr>
+        <w:t xml:space="preserve"> of Links which I used</w:t>
+      </w:r>
+    </w:p>
+    <w:p>
+      <w:pPr>
+        <w:spacing w:after="0" w:line="240" w:lineRule="auto"/>
         <w:rPr>
           <w:color w:val="4F81BD" w:themeColor="accent1"/>
           <w:sz w:val="36"/>
           <w:szCs w:val="36"/>
           <w:lang w:val="en-CA"/>
         </w:rPr>
-        <w:t xml:space="preserve"> Page Reference</w:t>
-      </w:r>
+      </w:pPr>
     </w:p>
     <w:p>
       <w:pPr>
@@ -2087,39 +1789,18 @@
           <w:lang w:val="en-CA"/>
         </w:rPr>
       </w:pPr>
-    </w:p>
-    <w:p>
-      <w:pPr>
-        <w:spacing w:after="0" w:line="240" w:lineRule="auto"/>
-        <w:rPr>
+      <w:r>
+        <w:rPr>
+          <w:noProof/>
           <w:color w:val="4F81BD" w:themeColor="accent1"/>
           <w:sz w:val="36"/>
           <w:szCs w:val="36"/>
           <w:lang w:val="en-CA"/>
         </w:rPr>
-      </w:pPr>
-    </w:p>
-    <w:p>
-      <w:pPr>
-        <w:spacing w:after="0" w:line="240" w:lineRule="auto"/>
-        <w:rPr>
-          <w:color w:val="4F81BD" w:themeColor="accent1"/>
-          <w:sz w:val="36"/>
-          <w:szCs w:val="36"/>
-          <w:lang w:val="en-CA"/>
-        </w:rPr>
-      </w:pPr>
-      <w:r>
-        <w:rPr>
-          <w:color w:val="4F81BD" w:themeColor="accent1"/>
-          <w:sz w:val="36"/>
-          <w:szCs w:val="36"/>
-          <w:lang w:val="en-CA"/>
-        </w:rPr>
         <w:drawing>
-          <wp:inline distT="0" distB="0" distL="0" distR="0" wp14:anchorId="7B2AD700" wp14:editId="236F14F1">
-            <wp:extent cx="5943600" cy="2852420"/>
-            <wp:effectExtent l="0" t="0" r="0" b="5080"/>
+          <wp:inline distT="0" distB="0" distL="0" distR="0" wp14:anchorId="7B2AD700" wp14:editId="405BF77F">
+            <wp:extent cx="5292609" cy="2540000"/>
+            <wp:effectExtent l="0" t="0" r="3810" b="0"/>
             <wp:docPr id="609381097" name="Picture 1"/>
             <wp:cNvGraphicFramePr>
               <a:graphicFrameLocks xmlns:a="http://schemas.openxmlformats.org/drawingml/2006/main" noChangeAspect="1"/>
@@ -2140,7 +1821,7 @@
                   <pic:spPr>
                     <a:xfrm>
                       <a:off x="0" y="0"/>
-                      <a:ext cx="5943600" cy="2852420"/>
+                      <a:ext cx="5315986" cy="2551219"/>
                     </a:xfrm>
                     <a:prstGeom prst="rect">
                       <a:avLst/>
@@ -2165,17 +1846,189 @@
       <w:pPr>
         <w:spacing w:after="0" w:line="240" w:lineRule="auto"/>
         <w:rPr>
-          <w:lang w:val="en-CA"/>
-        </w:rPr>
-      </w:pPr>
-    </w:p>
-    <w:p>
-      <w:pPr>
-        <w:spacing w:after="0" w:line="240" w:lineRule="auto"/>
-        <w:rPr>
-          <w:lang w:val="en-CA"/>
-        </w:rPr>
-      </w:pPr>
+          <w:color w:val="4F81BD" w:themeColor="accent1"/>
+          <w:sz w:val="40"/>
+          <w:szCs w:val="40"/>
+          <w:lang w:val="en-CA"/>
+        </w:rPr>
+      </w:pPr>
+      <w:r>
+        <w:rPr>
+          <w:color w:val="4F81BD" w:themeColor="accent1"/>
+          <w:sz w:val="40"/>
+          <w:szCs w:val="40"/>
+          <w:lang w:val="en-CA"/>
+        </w:rPr>
+        <w:t>GitHub:</w:t>
+      </w:r>
+      <w:r>
+        <w:rPr>
+          <w:color w:val="4F81BD" w:themeColor="accent1"/>
+          <w:sz w:val="40"/>
+          <w:szCs w:val="40"/>
+          <w:lang w:val="en-CA"/>
+        </w:rPr>
+        <w:t>Link</w:t>
+      </w:r>
+    </w:p>
+    <w:p>
+      <w:pPr>
+        <w:spacing w:after="0" w:line="240" w:lineRule="auto"/>
+        <w:rPr>
+          <w:color w:val="4F81BD" w:themeColor="accent1"/>
+          <w:sz w:val="40"/>
+          <w:szCs w:val="40"/>
+          <w:lang w:val="en-CA"/>
+        </w:rPr>
+      </w:pPr>
+    </w:p>
+    <w:p>
+      <w:pPr>
+        <w:spacing w:after="0" w:line="240" w:lineRule="auto"/>
+        <w:rPr>
+          <w:color w:val="4F81BD" w:themeColor="accent1"/>
+          <w:sz w:val="40"/>
+          <w:szCs w:val="40"/>
+          <w:lang w:val="en-CA"/>
+        </w:rPr>
+      </w:pPr>
+      <w:hyperlink r:id="rId24" w:history="1">
+        <w:r>
+          <w:rPr>
+            <w:rStyle w:val="Hyperlink"/>
+            <w:sz w:val="40"/>
+            <w:szCs w:val="40"/>
+            <w:lang w:val="en-CA"/>
+          </w:rPr>
+          <w:t>https://github.com/Puneet123-ctrl/ProjectWeb</w:t>
+        </w:r>
+      </w:hyperlink>
+    </w:p>
+    <w:p>
+      <w:pPr>
+        <w:spacing w:after="0" w:line="240" w:lineRule="auto"/>
+        <w:rPr>
+          <w:color w:val="4F81BD" w:themeColor="accent1"/>
+          <w:sz w:val="40"/>
+          <w:szCs w:val="40"/>
+          <w:lang w:val="en-CA"/>
+        </w:rPr>
+      </w:pPr>
+    </w:p>
+    <w:p>
+      <w:pPr>
+        <w:spacing w:after="0" w:line="240" w:lineRule="auto"/>
+        <w:rPr>
+          <w:lang w:val="en-CA"/>
+        </w:rPr>
+      </w:pPr>
+      <w:r>
+        <w:rPr>
+          <w:noProof/>
+          <w:lang w:val="en-CA"/>
+        </w:rPr>
+        <w:drawing>
+          <wp:inline distT="0" distB="0" distL="0" distR="0" wp14:anchorId="11E7D41A" wp14:editId="4CF6DC2B">
+            <wp:extent cx="5943600" cy="2824480"/>
+            <wp:effectExtent l="0" t="0" r="0" b="0"/>
+            <wp:docPr id="1899649629" name="Picture 1" descr="A screenshot of a computer&#10;&#10;AI-generated content may be incorrect."/>
+            <wp:cNvGraphicFramePr>
+              <a:graphicFrameLocks xmlns:a="http://schemas.openxmlformats.org/drawingml/2006/main" noChangeAspect="1"/>
+            </wp:cNvGraphicFramePr>
+            <a:graphic xmlns:a="http://schemas.openxmlformats.org/drawingml/2006/main">
+              <a:graphicData uri="http://schemas.openxmlformats.org/drawingml/2006/picture">
+                <pic:pic xmlns:pic="http://schemas.openxmlformats.org/drawingml/2006/picture">
+                  <pic:nvPicPr>
+                    <pic:cNvPr id="1899649629" name="Picture 1" descr="A screenshot of a computer&#10;&#10;AI-generated content may be incorrect."/>
+                    <pic:cNvPicPr/>
+                  </pic:nvPicPr>
+                  <pic:blipFill>
+                    <a:blip r:embed="rId25"/>
+                    <a:stretch>
+                      <a:fillRect/>
+                    </a:stretch>
+                  </pic:blipFill>
+                  <pic:spPr>
+                    <a:xfrm>
+                      <a:off x="0" y="0"/>
+                      <a:ext cx="5943600" cy="2824480"/>
+                    </a:xfrm>
+                    <a:prstGeom prst="rect">
+                      <a:avLst/>
+                    </a:prstGeom>
+                  </pic:spPr>
+                </pic:pic>
+              </a:graphicData>
+            </a:graphic>
+          </wp:inline>
+        </w:drawing>
+      </w:r>
+    </w:p>
+    <w:p>
+      <w:pPr>
+        <w:spacing w:after="0" w:line="240" w:lineRule="auto"/>
+        <w:rPr>
+          <w:lang w:val="en-CA"/>
+        </w:rPr>
+      </w:pPr>
+    </w:p>
+    <w:p>
+      <w:pPr>
+        <w:spacing w:after="0" w:line="240" w:lineRule="auto"/>
+        <w:rPr>
+          <w:lang w:val="en-CA"/>
+        </w:rPr>
+      </w:pPr>
+    </w:p>
+    <w:p>
+      <w:pPr>
+        <w:spacing w:after="0" w:line="240" w:lineRule="auto"/>
+        <w:rPr>
+          <w:lang w:val="en-CA"/>
+        </w:rPr>
+      </w:pPr>
+      <w:r>
+        <w:rPr>
+          <w:noProof/>
+          <w:lang w:val="en-CA"/>
+        </w:rPr>
+        <w:lastRenderedPageBreak/>
+        <w:drawing>
+          <wp:inline distT="0" distB="0" distL="0" distR="0" wp14:anchorId="0AD8553A" wp14:editId="1855B047">
+            <wp:extent cx="5943600" cy="2923540"/>
+            <wp:effectExtent l="0" t="0" r="0" b="0"/>
+            <wp:docPr id="279575650" name="Picture 1" descr="A screenshot of a computer&#10;&#10;AI-generated content may be incorrect."/>
+            <wp:cNvGraphicFramePr>
+              <a:graphicFrameLocks xmlns:a="http://schemas.openxmlformats.org/drawingml/2006/main" noChangeAspect="1"/>
+            </wp:cNvGraphicFramePr>
+            <a:graphic xmlns:a="http://schemas.openxmlformats.org/drawingml/2006/main">
+              <a:graphicData uri="http://schemas.openxmlformats.org/drawingml/2006/picture">
+                <pic:pic xmlns:pic="http://schemas.openxmlformats.org/drawingml/2006/picture">
+                  <pic:nvPicPr>
+                    <pic:cNvPr id="279575650" name="Picture 1" descr="A screenshot of a computer&#10;&#10;AI-generated content may be incorrect."/>
+                    <pic:cNvPicPr/>
+                  </pic:nvPicPr>
+                  <pic:blipFill>
+                    <a:blip r:embed="rId26"/>
+                    <a:stretch>
+                      <a:fillRect/>
+                    </a:stretch>
+                  </pic:blipFill>
+                  <pic:spPr>
+                    <a:xfrm>
+                      <a:off x="0" y="0"/>
+                      <a:ext cx="5943600" cy="2923540"/>
+                    </a:xfrm>
+                    <a:prstGeom prst="rect">
+                      <a:avLst/>
+                    </a:prstGeom>
+                  </pic:spPr>
+                </pic:pic>
+              </a:graphicData>
+            </a:graphic>
+          </wp:inline>
+        </w:drawing>
+      </w:r>
     </w:p>
     <w:sectPr>
       <w:pgSz w:w="12240" w:h="15840"/>
@@ -3063,7 +2916,6 @@
   <w:style w:type="character" w:default="1" w:styleId="DefaultParagraphFont">
     <w:name w:val="Default Paragraph Font"/>
     <w:uiPriority w:val="1"/>
-    <w:semiHidden/>
     <w:unhideWhenUsed/>
   </w:style>
   <w:style w:type="table" w:default="1" w:styleId="TableNormal">
@@ -3196,6 +3048,29 @@
     <w:link w:val="Footer"/>
     <w:uiPriority w:val="99"/>
     <w:rsid w:val="00A96829"/>
+  </w:style>
+  <w:style w:type="character" w:styleId="Hyperlink">
+    <w:name w:val="Hyperlink"/>
+    <w:basedOn w:val="DefaultParagraphFont"/>
+    <w:uiPriority w:val="99"/>
+    <w:unhideWhenUsed/>
+    <w:rsid w:val="005A7132"/>
+    <w:rPr>
+      <w:color w:val="0000FF" w:themeColor="hyperlink"/>
+      <w:u w:val="single"/>
+    </w:rPr>
+  </w:style>
+  <w:style w:type="character" w:styleId="UnresolvedMention">
+    <w:name w:val="Unresolved Mention"/>
+    <w:basedOn w:val="DefaultParagraphFont"/>
+    <w:uiPriority w:val="99"/>
+    <w:semiHidden/>
+    <w:unhideWhenUsed/>
+    <w:rsid w:val="005A7132"/>
+    <w:rPr>
+      <w:color w:val="605E5C"/>
+      <w:shd w:val="clear" w:color="auto" w:fill="E1DFDD"/>
+    </w:rPr>
   </w:style>
 </w:styles>
 </file>

</xml_diff>